<commit_message>
Auto Daily 8:00 PM Dashboard Update [2026-07-29 20:00]
</commit_message>
<xml_diff>
--- a/docs/weekly/2026-W31_當週執行率回顧報告.docx
+++ b/docs/weekly/2026-W31_當週執行率回顧報告.docx
@@ -21,7 +21,7 @@
           <w:color w:val="555555"/>
           <w:sz w:val="20"/>
         </w:rPr>
-        <w:t>週期：2026/07/27–2026/08/02　｜　整體時間執行率：8.1%</w:t>
+        <w:t>週期：2026/07/27–2026/08/02　｜　整體時間執行率：19.0%</w:t>
       </w:r>
     </w:p>
     <w:p>
@@ -347,7 +347,7 @@
                 <w:color w:val="000000"/>
                 <w:sz w:val="19"/>
               </w:rPr>
-              <w:t>0.00 hr</w:t>
+              <w:t>1.32 hr</w:t>
             </w:r>
           </w:p>
         </w:tc>
@@ -374,7 +374,7 @@
                 <w:color w:val="000000"/>
                 <w:sz w:val="19"/>
               </w:rPr>
-              <w:t>0.0%</w:t>
+              <w:t>52.7%</w:t>
             </w:r>
           </w:p>
         </w:tc>
@@ -428,7 +428,7 @@
                 <w:color w:val="000000"/>
                 <w:sz w:val="19"/>
               </w:rPr>
-              <w:t>0.00 km</w:t>
+              <w:t>3.90 km</w:t>
             </w:r>
           </w:p>
         </w:tc>
@@ -1797,7 +1797,7 @@
                 <w:color w:val="000000"/>
                 <w:sz w:val="19"/>
               </w:rPr>
-              <w:t>0分</w:t>
+              <w:t>79分 / 3.90km</w:t>
             </w:r>
           </w:p>
         </w:tc>
@@ -1824,7 +1824,7 @@
                 <w:color w:val="000000"/>
                 <w:sz w:val="19"/>
               </w:rPr>
-              <w:t>❌ 未執行</w:t>
+              <w:t>✅ 已完成</w:t>
             </w:r>
           </w:p>
         </w:tc>

</xml_diff>

<commit_message>
Manual sync 2026-07-30 bike & 2026-07-31 swim updates
</commit_message>
<xml_diff>
--- a/docs/weekly/2026-W31_當週執行率回顧報告.docx
+++ b/docs/weekly/2026-W31_當週執行率回顧報告.docx
@@ -21,7 +21,7 @@
           <w:color w:val="555555"/>
           <w:sz w:val="20"/>
         </w:rPr>
-        <w:t>週期：2026/07/27–2026/08/02　｜　整體時間執行率：19.0%</w:t>
+        <w:t>週期：2026/07/27–2026/08/02　｜　整體時間執行率：34.3%</w:t>
       </w:r>
     </w:p>
     <w:p>
@@ -347,7 +347,7 @@
                 <w:color w:val="000000"/>
                 <w:sz w:val="19"/>
               </w:rPr>
-              <w:t>1.32 hr</w:t>
+              <w:t>2.40 hr</w:t>
             </w:r>
           </w:p>
         </w:tc>
@@ -374,7 +374,7 @@
                 <w:color w:val="000000"/>
                 <w:sz w:val="19"/>
               </w:rPr>
-              <w:t>52.7%</w:t>
+              <w:t>96.0%</w:t>
             </w:r>
           </w:p>
         </w:tc>
@@ -428,7 +428,7 @@
                 <w:color w:val="000000"/>
                 <w:sz w:val="19"/>
               </w:rPr>
-              <w:t>3.90 km</w:t>
+              <w:t>7.35 km</w:t>
             </w:r>
           </w:p>
         </w:tc>
@@ -565,7 +565,7 @@
                 <w:color w:val="000000"/>
                 <w:sz w:val="19"/>
               </w:rPr>
-              <w:t>0.00 hr</w:t>
+              <w:t>0.75 hr</w:t>
             </w:r>
           </w:p>
         </w:tc>
@@ -592,7 +592,7 @@
                 <w:color w:val="000000"/>
                 <w:sz w:val="19"/>
               </w:rPr>
-              <w:t>0.0%</w:t>
+              <w:t>13.6%</w:t>
             </w:r>
           </w:p>
         </w:tc>
@@ -646,7 +646,7 @@
                 <w:color w:val="000000"/>
                 <w:sz w:val="19"/>
               </w:rPr>
-              <w:t>0.00 km</w:t>
+              <w:t>19.60 km</w:t>
             </w:r>
           </w:p>
         </w:tc>
@@ -2295,7 +2295,7 @@
                 <w:color w:val="000000"/>
                 <w:sz w:val="19"/>
               </w:rPr>
-              <w:t>0分</w:t>
+              <w:t>45分 / 19.60km</w:t>
             </w:r>
           </w:p>
         </w:tc>
@@ -2322,7 +2322,7 @@
                 <w:color w:val="000000"/>
                 <w:sz w:val="19"/>
               </w:rPr>
-              <w:t>❌ 未執行</w:t>
+              <w:t>✅ 已完成</w:t>
             </w:r>
           </w:p>
         </w:tc>
@@ -2461,7 +2461,7 @@
                 <w:color w:val="000000"/>
                 <w:sz w:val="19"/>
               </w:rPr>
-              <w:t>0分</w:t>
+              <w:t>65分 / 3.45km</w:t>
             </w:r>
           </w:p>
         </w:tc>
@@ -2488,7 +2488,7 @@
                 <w:color w:val="000000"/>
                 <w:sz w:val="19"/>
               </w:rPr>
-              <w:t>❌ 未執行</w:t>
+              <w:t>✅ 已完成</w:t>
             </w:r>
           </w:p>
         </w:tc>

</xml_diff>

<commit_message>
Auto Daily 8:00 PM Dashboard Update [2026-08-01 20:00]
</commit_message>
<xml_diff>
--- a/docs/weekly/2026-W31_當週執行率回顧報告.docx
+++ b/docs/weekly/2026-W31_當週執行率回顧報告.docx
@@ -21,7 +21,7 @@
           <w:color w:val="555555"/>
           <w:sz w:val="20"/>
         </w:rPr>
-        <w:t>週期：2026/07/27–2026/08/02　｜　整體時間執行率：34.3%</w:t>
+        <w:t>週期：2026/07/27–2026/08/02　｜　整體時間執行率：61.9%</w:t>
       </w:r>
     </w:p>
     <w:p>
@@ -565,7 +565,7 @@
                 <w:color w:val="000000"/>
                 <w:sz w:val="19"/>
               </w:rPr>
-              <w:t>0.75 hr</w:t>
+              <w:t>4.07 hr</w:t>
             </w:r>
           </w:p>
         </w:tc>
@@ -592,7 +592,7 @@
                 <w:color w:val="000000"/>
                 <w:sz w:val="19"/>
               </w:rPr>
-              <w:t>13.6%</w:t>
+              <w:t>73.9%</w:t>
             </w:r>
           </w:p>
         </w:tc>
@@ -646,7 +646,7 @@
                 <w:color w:val="000000"/>
                 <w:sz w:val="19"/>
               </w:rPr>
-              <w:t>19.60 km</w:t>
+              <w:t>108.84 km</w:t>
             </w:r>
           </w:p>
         </w:tc>
@@ -2627,7 +2627,7 @@
                 <w:color w:val="000000"/>
                 <w:sz w:val="19"/>
               </w:rPr>
-              <w:t>0分</w:t>
+              <w:t>199分 / 89.24km</w:t>
             </w:r>
           </w:p>
         </w:tc>
@@ -2654,7 +2654,7 @@
                 <w:color w:val="000000"/>
                 <w:sz w:val="19"/>
               </w:rPr>
-              <w:t>❌ 未執行</w:t>
+              <w:t>✅ 已完成</w:t>
             </w:r>
           </w:p>
         </w:tc>

</xml_diff>

<commit_message>
Auto update weekly execution report and 52-week dashboard
</commit_message>
<xml_diff>
--- a/docs/weekly/2026-W31_當週執行率回顧報告.docx
+++ b/docs/weekly/2026-W31_當週執行率回顧報告.docx
@@ -21,7 +21,7 @@
           <w:color w:val="555555"/>
           <w:sz w:val="20"/>
         </w:rPr>
-        <w:t>週期：2026/07/27–2026/08/02　｜　整體時間執行率：61.9%</w:t>
+        <w:t>週期：2026/07/27–2026/08/02　｜　整體時間執行率：72.9%</w:t>
       </w:r>
     </w:p>
     <w:p>
@@ -783,7 +783,7 @@
                 <w:color w:val="000000"/>
                 <w:sz w:val="19"/>
               </w:rPr>
-              <w:t>0.97 hr</w:t>
+              <w:t>2.28 hr</w:t>
             </w:r>
           </w:p>
         </w:tc>
@@ -810,7 +810,7 @@
                 <w:color w:val="000000"/>
                 <w:sz w:val="19"/>
               </w:rPr>
-              <w:t>24.2%</w:t>
+              <w:t>57.1%</w:t>
             </w:r>
           </w:p>
         </w:tc>
@@ -864,7 +864,7 @@
                 <w:color w:val="000000"/>
                 <w:sz w:val="19"/>
               </w:rPr>
-              <w:t>9.31 km</w:t>
+              <w:t>20.84 km</w:t>
             </w:r>
           </w:p>
         </w:tc>
@@ -891,7 +891,7 @@
                 <w:color w:val="000000"/>
                 <w:sz w:val="19"/>
               </w:rPr>
-              <w:t>23.3%</w:t>
+              <w:t>52.2%</w:t>
             </w:r>
           </w:p>
         </w:tc>
@@ -2959,7 +2959,7 @@
                 <w:color w:val="000000"/>
                 <w:sz w:val="19"/>
               </w:rPr>
-              <w:t>0分</w:t>
+              <w:t>79分 / 11.53km</w:t>
             </w:r>
           </w:p>
         </w:tc>
@@ -2986,7 +2986,7 @@
                 <w:color w:val="000000"/>
                 <w:sz w:val="19"/>
               </w:rPr>
-              <w:t>❌ 未執行</w:t>
+              <w:t>✅ 已完成</w:t>
             </w:r>
           </w:p>
         </w:tc>

</xml_diff>